<commit_message>
Báo cáo: cập nhật kết quả kiểm thử thực tế (TC2 thiếu ANS, TC7 bỏ trống)
</commit_message>
<xml_diff>
--- a/Files/BaoCao_TOEIC_Reading.docx
+++ b/Files/BaoCao_TOEIC_Reading.docx
@@ -5168,7 +5168,7 @@
               <w:rPr>
                 <w:sz w:val="18"/>
               </w:rPr>
-              <w:t>Import file thiếu thẻ ANS</w:t>
+              <w:t>Import file thiếu thẻ ANS ở câu 134</w:t>
             </w:r>
           </w:p>
         </w:tc>
@@ -5196,7 +5196,7 @@
               <w:rPr>
                 <w:sz w:val="18"/>
               </w:rPr>
-              <w:t>Trả lỗi MISSING_ANS kèm số câu, bảng rỗng</w:t>
+              <w:t>success=false, examId=null, lỗi MISSING_ANS “Câu 134: thiếu thẻ đáp án”, số đề trong CSDL không đổi (1 → 1)</w:t>
             </w:r>
           </w:p>
         </w:tc>
@@ -5528,7 +5528,7 @@
               <w:rPr>
                 <w:sz w:val="18"/>
               </w:rPr>
-              <w:t>Bỏ trống toàn bộ</w:t>
+              <w:t>Bỏ trống toàn bộ 100 câu rồi nộp</w:t>
             </w:r>
           </w:p>
         </w:tc>
@@ -5556,7 +5556,7 @@
               <w:rPr>
                 <w:sz w:val="18"/>
               </w:rPr>
-              <w:t>Score=0, Skipped=100</w:t>
+              <w:t>Score=0, Correct=0, Wrong=0, Skipped=100</w:t>
             </w:r>
           </w:p>
         </w:tc>

</xml_diff>

<commit_message>
Hoàn thiện: sửa câu hỏi trên web (form + validate), xoá đề, trích ảnh từ .docx ra uploads và phục vụ qua /uploads, đăng nhập mặc định vào /Exam; báo cáo 17 trang
</commit_message>
<xml_diff>
--- a/Files/BaoCao_TOEIC_Reading.docx
+++ b/Files/BaoCao_TOEIC_Reading.docx
@@ -3172,6 +3172,19 @@
     </w:p>
     <w:p>
       <w:pPr>
+        <w:spacing w:after="120" w:before="80"/>
+      </w:pPr>
+      <w:r>
+        <w:rPr>
+          <w:b w:val="0"/>
+          <w:i w:val="0"/>
+          <w:sz w:val="22"/>
+        </w:rPr>
+        <w:t>Ảnh nhúng trong file Word được trích ra ngay khi import: mỗi ảnh lưu thành một tệp trong thư mục uploads/exams/{examId}/, đường dẫn ghi vào cột ImagePath của RtPassageDocuments và được cả web giảng viên lẫn API phục vụ qua /uploads — nhờ vậy đề có biểu mẫu, hoá đơn, tin nhắn vẫn hiển thị đúng sau khi upload, không cần chép ảnh thủ công.</w:t>
+      </w:r>
+    </w:p>
+    <w:p>
+      <w:pPr>
         <w:spacing w:after="60"/>
         <w:jc w:val="center"/>
       </w:pPr>
@@ -3474,7 +3487,61 @@
           <w:i w:val="0"/>
           <w:sz w:val="22"/>
         </w:rPr>
-        <w:t>Câu hỏi, phương án, đáp án và gợi ý được sửa qua UpdateQuestion của ExamAppService (dùng cho chức năng rà soát lỗi chính tả sau khi import). Trang xem trước hiển thị đúng những gì sinh viên sẽ thấy, kèm đáp án và gợi ý của giảng viên.</w:t>
+        <w:t>Mỗi câu trong trang xem trước có nút Sửa, mở form chỉnh sửa: nội dung câu hỏi, 4 phương án, chọn đáp án đúng bằng radio và gợi ý giải thích. Form kiểm tra trước khi lưu — thiếu phương án, để trống câu hỏi hoặc gợi ý đều bị chặn kèm thông báo; lưu thành công hiện dòng xác nhận và quay lại trang xem trước với nội dung mới.</w:t>
+      </w:r>
+    </w:p>
+    <w:p>
+      <w:pPr>
+        <w:spacing w:after="60"/>
+        <w:jc w:val="center"/>
+      </w:pPr>
+      <w:r>
+        <w:drawing>
+          <wp:inline xmlns:a="http://schemas.openxmlformats.org/drawingml/2006/main" xmlns:pic="http://schemas.openxmlformats.org/drawingml/2006/picture">
+            <wp:extent cx="5400000" cy="3375000"/>
+            <wp:docPr id="5" name="Picture 5"/>
+            <wp:cNvGraphicFramePr>
+              <a:graphicFrameLocks noChangeAspect="1"/>
+            </wp:cNvGraphicFramePr>
+            <a:graphic>
+              <a:graphicData uri="http://schemas.openxmlformats.org/drawingml/2006/picture">
+                <pic:pic>
+                  <pic:nvPicPr>
+                    <pic:cNvPr id="0" name="teacher-edit.png"/>
+                    <pic:cNvPicPr/>
+                  </pic:nvPicPr>
+                  <pic:blipFill>
+                    <a:blip r:embed="rId13"/>
+                    <a:stretch>
+                      <a:fillRect/>
+                    </a:stretch>
+                  </pic:blipFill>
+                  <pic:spPr>
+                    <a:xfrm>
+                      <a:off x="0" y="0"/>
+                      <a:ext cx="5400000" cy="3375000"/>
+                    </a:xfrm>
+                    <a:prstGeom prst="rect"/>
+                  </pic:spPr>
+                </pic:pic>
+              </a:graphicData>
+            </a:graphic>
+          </wp:inline>
+        </w:drawing>
+      </w:r>
+    </w:p>
+    <w:p>
+      <w:pPr>
+        <w:spacing w:after="240"/>
+        <w:jc w:val="center"/>
+      </w:pPr>
+      <w:r>
+        <w:rPr>
+          <w:i/>
+          <w:color w:val="595959"/>
+          <w:sz w:val="18"/>
+        </w:rPr>
+        <w:t>Hình 5. Form cập nhật câu hỏi: nội dung, 4 phương án, đáp án đúng và gợi ý</w:t>
       </w:r>
     </w:p>
     <w:p>
@@ -3538,7 +3605,7 @@
         <w:drawing>
           <wp:inline xmlns:a="http://schemas.openxmlformats.org/drawingml/2006/main" xmlns:pic="http://schemas.openxmlformats.org/drawingml/2006/picture">
             <wp:extent cx="5688000" cy="3555000"/>
-            <wp:docPr id="5" name="Picture 5"/>
+            <wp:docPr id="6" name="Picture 6"/>
             <wp:cNvGraphicFramePr>
               <a:graphicFrameLocks noChangeAspect="1"/>
             </wp:cNvGraphicFramePr>
@@ -3550,7 +3617,7 @@
                     <pic:cNvPicPr/>
                   </pic:nvPicPr>
                   <pic:blipFill>
-                    <a:blip r:embed="rId13"/>
+                    <a:blip r:embed="rId14"/>
                     <a:stretch>
                       <a:fillRect/>
                     </a:stretch>
@@ -3580,7 +3647,7 @@
           <w:color w:val="595959"/>
           <w:sz w:val="18"/>
         </w:rPr>
-        <w:t>Hình 5. Thống kê đề thi: 2 lượt làm, điểm TB 55, Top 10 câu sai</w:t>
+        <w:t>Hình 6. Thống kê đề thi: 2 lượt làm, điểm TB 55, Top 10 câu sai</w:t>
       </w:r>
     </w:p>
     <w:p>
@@ -3644,7 +3711,7 @@
         <w:drawing>
           <wp:inline xmlns:a="http://schemas.openxmlformats.org/drawingml/2006/main" xmlns:pic="http://schemas.openxmlformats.org/drawingml/2006/picture">
             <wp:extent cx="2592000" cy="5554286"/>
-            <wp:docPr id="6" name="Picture 6"/>
+            <wp:docPr id="7" name="Picture 7"/>
             <wp:cNvGraphicFramePr>
               <a:graphicFrameLocks noChangeAspect="1"/>
             </wp:cNvGraphicFramePr>
@@ -3656,7 +3723,7 @@
                     <pic:cNvPicPr/>
                   </pic:nvPicPr>
                   <pic:blipFill>
-                    <a:blip r:embed="rId14"/>
+                    <a:blip r:embed="rId15"/>
                     <a:stretch>
                       <a:fillRect/>
                     </a:stretch>
@@ -3686,7 +3753,7 @@
           <w:color w:val="595959"/>
           <w:sz w:val="18"/>
         </w:rPr>
-        <w:t>Hình 6. Danh sách đề trên app sinh viên</w:t>
+        <w:t>Hình 7. Danh sách đề trên app sinh viên</w:t>
       </w:r>
     </w:p>
     <w:p>
@@ -3759,7 +3826,7 @@
         <w:drawing>
           <wp:inline xmlns:a="http://schemas.openxmlformats.org/drawingml/2006/main" xmlns:pic="http://schemas.openxmlformats.org/drawingml/2006/picture">
             <wp:extent cx="2592000" cy="5554286"/>
-            <wp:docPr id="7" name="Picture 7"/>
+            <wp:docPr id="8" name="Picture 8"/>
             <wp:cNvGraphicFramePr>
               <a:graphicFrameLocks noChangeAspect="1"/>
             </wp:cNvGraphicFramePr>
@@ -3771,7 +3838,7 @@
                     <pic:cNvPicPr/>
                   </pic:nvPicPr>
                   <pic:blipFill>
-                    <a:blip r:embed="rId15"/>
+                    <a:blip r:embed="rId16"/>
                     <a:stretch>
                       <a:fillRect/>
                     </a:stretch>
@@ -3801,7 +3868,7 @@
           <w:color w:val="595959"/>
           <w:sz w:val="18"/>
         </w:rPr>
-        <w:t>Hình 7. Màn hình làm bài: đồng hồ 74:50, tiến độ 1/100, đáp án B đã chọn</w:t>
+        <w:t>Hình 8. Màn hình làm bài: đồng hồ 74:50, tiến độ 1/100, đáp án B đã chọn</w:t>
       </w:r>
     </w:p>
     <w:p>
@@ -3865,7 +3932,7 @@
         <w:drawing>
           <wp:inline xmlns:a="http://schemas.openxmlformats.org/drawingml/2006/main" xmlns:pic="http://schemas.openxmlformats.org/drawingml/2006/picture">
             <wp:extent cx="2951999" cy="14057138"/>
-            <wp:docPr id="8" name="Picture 8"/>
+            <wp:docPr id="9" name="Picture 9"/>
             <wp:cNvGraphicFramePr>
               <a:graphicFrameLocks noChangeAspect="1"/>
             </wp:cNvGraphicFramePr>
@@ -3877,7 +3944,7 @@
                     <pic:cNvPicPr/>
                   </pic:nvPicPr>
                   <pic:blipFill>
-                    <a:blip r:embed="rId16"/>
+                    <a:blip r:embed="rId17"/>
                     <a:stretch>
                       <a:fillRect/>
                     </a:stretch>
@@ -3907,7 +3974,7 @@
           <w:color w:val="595959"/>
           <w:sz w:val="18"/>
         </w:rPr>
-        <w:t>Hình 8. Kết quả 70/100 và phần xem lại đáp án kèm gợi ý</w:t>
+        <w:t>Hình 9. Kết quả 70/100 và phần xem lại đáp án kèm gợi ý</w:t>
       </w:r>
     </w:p>
     <w:p>
@@ -4114,7 +4181,7 @@
         <w:drawing>
           <wp:inline xmlns:a="http://schemas.openxmlformats.org/drawingml/2006/main" xmlns:pic="http://schemas.openxmlformats.org/drawingml/2006/picture">
             <wp:extent cx="5688000" cy="2938800"/>
-            <wp:docPr id="9" name="Picture 9"/>
+            <wp:docPr id="10" name="Picture 10"/>
             <wp:cNvGraphicFramePr>
               <a:graphicFrameLocks noChangeAspect="1"/>
             </wp:cNvGraphicFramePr>
@@ -4123,60 +4190,6 @@
                 <pic:pic>
                   <pic:nvPicPr>
                     <pic:cNvPr id="0" name="figma_t_final.png"/>
-                    <pic:cNvPicPr/>
-                  </pic:nvPicPr>
-                  <pic:blipFill>
-                    <a:blip r:embed="rId17"/>
-                    <a:stretch>
-                      <a:fillRect/>
-                    </a:stretch>
-                  </pic:blipFill>
-                  <pic:spPr>
-                    <a:xfrm>
-                      <a:off x="0" y="0"/>
-                      <a:ext cx="5688000" cy="2938800"/>
-                    </a:xfrm>
-                    <a:prstGeom prst="rect"/>
-                  </pic:spPr>
-                </pic:pic>
-              </a:graphicData>
-            </a:graphic>
-          </wp:inline>
-        </w:drawing>
-      </w:r>
-    </w:p>
-    <w:p>
-      <w:pPr>
-        <w:spacing w:after="240"/>
-        <w:jc w:val="center"/>
-      </w:pPr>
-      <w:r>
-        <w:rPr>
-          <w:i/>
-          <w:color w:val="595959"/>
-          <w:sz w:val="18"/>
-        </w:rPr>
-        <w:t>Hình 9. Page Teacher Web trong Figma (6 frame)</w:t>
-      </w:r>
-    </w:p>
-    <w:p>
-      <w:pPr>
-        <w:spacing w:after="60"/>
-        <w:jc w:val="center"/>
-      </w:pPr>
-      <w:r>
-        <w:drawing>
-          <wp:inline xmlns:a="http://schemas.openxmlformats.org/drawingml/2006/main" xmlns:pic="http://schemas.openxmlformats.org/drawingml/2006/picture">
-            <wp:extent cx="5688000" cy="2938800"/>
-            <wp:docPr id="10" name="Picture 10"/>
-            <wp:cNvGraphicFramePr>
-              <a:graphicFrameLocks noChangeAspect="1"/>
-            </wp:cNvGraphicFramePr>
-            <a:graphic>
-              <a:graphicData uri="http://schemas.openxmlformats.org/drawingml/2006/picture">
-                <pic:pic>
-                  <pic:nvPicPr>
-                    <pic:cNvPr id="0" name="figma_mobile_fit2.png"/>
                     <pic:cNvPicPr/>
                   </pic:nvPicPr>
                   <pic:blipFill>
@@ -4210,7 +4223,61 @@
           <w:color w:val="595959"/>
           <w:sz w:val="18"/>
         </w:rPr>
-        <w:t>Hình 10. Page Student Mobile trong Figma (6 frame)</w:t>
+        <w:t>Hình 10. Page Teacher Web trong Figma (6 frame)</w:t>
+      </w:r>
+    </w:p>
+    <w:p>
+      <w:pPr>
+        <w:spacing w:after="60"/>
+        <w:jc w:val="center"/>
+      </w:pPr>
+      <w:r>
+        <w:drawing>
+          <wp:inline xmlns:a="http://schemas.openxmlformats.org/drawingml/2006/main" xmlns:pic="http://schemas.openxmlformats.org/drawingml/2006/picture">
+            <wp:extent cx="5688000" cy="2938800"/>
+            <wp:docPr id="11" name="Picture 11"/>
+            <wp:cNvGraphicFramePr>
+              <a:graphicFrameLocks noChangeAspect="1"/>
+            </wp:cNvGraphicFramePr>
+            <a:graphic>
+              <a:graphicData uri="http://schemas.openxmlformats.org/drawingml/2006/picture">
+                <pic:pic>
+                  <pic:nvPicPr>
+                    <pic:cNvPr id="0" name="figma_mobile_fit2.png"/>
+                    <pic:cNvPicPr/>
+                  </pic:nvPicPr>
+                  <pic:blipFill>
+                    <a:blip r:embed="rId19"/>
+                    <a:stretch>
+                      <a:fillRect/>
+                    </a:stretch>
+                  </pic:blipFill>
+                  <pic:spPr>
+                    <a:xfrm>
+                      <a:off x="0" y="0"/>
+                      <a:ext cx="5688000" cy="2938800"/>
+                    </a:xfrm>
+                    <a:prstGeom prst="rect"/>
+                  </pic:spPr>
+                </pic:pic>
+              </a:graphicData>
+            </a:graphic>
+          </wp:inline>
+        </w:drawing>
+      </w:r>
+    </w:p>
+    <w:p>
+      <w:pPr>
+        <w:spacing w:after="240"/>
+        <w:jc w:val="center"/>
+      </w:pPr>
+      <w:r>
+        <w:rPr>
+          <w:i/>
+          <w:color w:val="595959"/>
+          <w:sz w:val="18"/>
+        </w:rPr>
+        <w:t>Hình 11. Page Student Mobile trong Figma (6 frame)</w:t>
       </w:r>
     </w:p>
     <w:p>
@@ -5791,6 +5858,150 @@
           </w:p>
         </w:tc>
       </w:tr>
+      <w:tr>
+        <w:tc>
+          <w:tcPr>
+            <w:tcW w:type="dxa" w:w="737"/>
+          </w:tcPr>
+          <w:p>
+            <w:r/>
+            <w:r>
+              <w:rPr>
+                <w:sz w:val="18"/>
+              </w:rPr>
+              <w:t>TC11</w:t>
+            </w:r>
+          </w:p>
+        </w:tc>
+        <w:tc>
+          <w:tcPr>
+            <w:tcW w:type="dxa" w:w="2608"/>
+          </w:tcPr>
+          <w:p>
+            <w:r/>
+            <w:r>
+              <w:rPr>
+                <w:sz w:val="18"/>
+              </w:rPr>
+              <w:t>Sửa gợi ý câu 101 trên web rồi lưu</w:t>
+            </w:r>
+          </w:p>
+        </w:tc>
+        <w:tc>
+          <w:tcPr>
+            <w:tcW w:type="dxa" w:w="2494"/>
+          </w:tcPr>
+          <w:p>
+            <w:r/>
+            <w:r>
+              <w:rPr>
+                <w:sz w:val="18"/>
+              </w:rPr>
+              <w:t>Lưu vào CSDL, xem trước hiện nội dung mới, 4 phương án giữ nguyên</w:t>
+            </w:r>
+          </w:p>
+        </w:tc>
+        <w:tc>
+          <w:tcPr>
+            <w:tcW w:type="dxa" w:w="2494"/>
+          </w:tcPr>
+          <w:p>
+            <w:r/>
+            <w:r>
+              <w:rPr>
+                <w:sz w:val="18"/>
+              </w:rPr>
+              <w:t>Flash “Đã lưu thay đổi câu hỏi.”, cột Hint đổi trong SQL, OptionKey A vẫn “opens”</w:t>
+            </w:r>
+          </w:p>
+        </w:tc>
+        <w:tc>
+          <w:tcPr>
+            <w:tcW w:type="dxa" w:w="850"/>
+          </w:tcPr>
+          <w:p>
+            <w:r/>
+            <w:r>
+              <w:rPr>
+                <w:sz w:val="18"/>
+              </w:rPr>
+              <w:t>Đạt</w:t>
+            </w:r>
+          </w:p>
+        </w:tc>
+      </w:tr>
+      <w:tr>
+        <w:tc>
+          <w:tcPr>
+            <w:tcW w:type="dxa" w:w="737"/>
+          </w:tcPr>
+          <w:p>
+            <w:r/>
+            <w:r>
+              <w:rPr>
+                <w:sz w:val="18"/>
+              </w:rPr>
+              <w:t>TC12</w:t>
+            </w:r>
+          </w:p>
+        </w:tc>
+        <w:tc>
+          <w:tcPr>
+            <w:tcW w:type="dxa" w:w="2608"/>
+          </w:tcPr>
+          <w:p>
+            <w:r/>
+            <w:r>
+              <w:rPr>
+                <w:sz w:val="18"/>
+              </w:rPr>
+              <w:t>Import đề có 7 ảnh, mở lại xem trước</w:t>
+            </w:r>
+          </w:p>
+        </w:tc>
+        <w:tc>
+          <w:tcPr>
+            <w:tcW w:type="dxa" w:w="2494"/>
+          </w:tcPr>
+          <w:p>
+            <w:r/>
+            <w:r>
+              <w:rPr>
+                <w:sz w:val="18"/>
+              </w:rPr>
+              <w:t>Ảnh trích từ .docx được lưu và hiển thị</w:t>
+            </w:r>
+          </w:p>
+        </w:tc>
+        <w:tc>
+          <w:tcPr>
+            <w:tcW w:type="dxa" w:w="2494"/>
+          </w:tcPr>
+          <w:p>
+            <w:r/>
+            <w:r>
+              <w:rPr>
+                <w:sz w:val="18"/>
+              </w:rPr>
+              <w:t>7 tệp trong uploads/exams/4/, GET /uploads/... trả 200 (259.205 byte), 7 thẻ img có naturalWidth &gt; 0</w:t>
+            </w:r>
+          </w:p>
+        </w:tc>
+        <w:tc>
+          <w:tcPr>
+            <w:tcW w:type="dxa" w:w="850"/>
+          </w:tcPr>
+          <w:p>
+            <w:r/>
+            <w:r>
+              <w:rPr>
+                <w:sz w:val="18"/>
+              </w:rPr>
+              <w:t>Đạt</w:t>
+            </w:r>
+          </w:p>
+        </w:tc>
+      </w:tr>
     </w:tbl>
     <w:p>
       <w:pPr>

</xml_diff>

<commit_message>
Thêm sơ đồ CSDL (ERD) dạng HTML + PNG, chèn Hình 1 vào báo cáo (18 trang)
</commit_message>
<xml_diff>
--- a/Files/BaoCao_TOEIC_Reading.docx
+++ b/Files/BaoCao_TOEIC_Reading.docx
@@ -1857,6 +1857,60 @@
     </w:p>
     <w:p>
       <w:pPr>
+        <w:spacing w:after="60"/>
+        <w:jc w:val="center"/>
+      </w:pPr>
+      <w:r>
+        <w:drawing>
+          <wp:inline xmlns:a="http://schemas.openxmlformats.org/drawingml/2006/main" xmlns:pic="http://schemas.openxmlformats.org/drawingml/2006/picture">
+            <wp:extent cx="5832000" cy="4793425"/>
+            <wp:docPr id="1" name="Picture 1"/>
+            <wp:cNvGraphicFramePr>
+              <a:graphicFrameLocks noChangeAspect="1"/>
+            </wp:cNvGraphicFramePr>
+            <a:graphic>
+              <a:graphicData uri="http://schemas.openxmlformats.org/drawingml/2006/picture">
+                <pic:pic>
+                  <pic:nvPicPr>
+                    <pic:cNvPr id="0" name="ERD.png"/>
+                    <pic:cNvPicPr/>
+                  </pic:nvPicPr>
+                  <pic:blipFill>
+                    <a:blip r:embed="rId9"/>
+                    <a:stretch>
+                      <a:fillRect/>
+                    </a:stretch>
+                  </pic:blipFill>
+                  <pic:spPr>
+                    <a:xfrm>
+                      <a:off x="0" y="0"/>
+                      <a:ext cx="5832000" cy="4793425"/>
+                    </a:xfrm>
+                    <a:prstGeom prst="rect"/>
+                  </pic:spPr>
+                </pic:pic>
+              </a:graphicData>
+            </a:graphic>
+          </wp:inline>
+        </w:drawing>
+      </w:r>
+    </w:p>
+    <w:p>
+      <w:pPr>
+        <w:spacing w:after="240"/>
+        <w:jc w:val="center"/>
+      </w:pPr>
+      <w:r>
+        <w:rPr>
+          <w:i/>
+          <w:color w:val="595959"/>
+          <w:sz w:val="18"/>
+        </w:rPr>
+        <w:t>Hình 1. Sơ đồ quan hệ 7 bảng nghiệp vụ trong ToeicDb (khoá chính, khoá ngoại, quan hệ 1–n)</w:t>
+      </w:r>
+    </w:p>
+    <w:p>
+      <w:pPr>
         <w:pStyle w:val="Heading2"/>
         <w:spacing w:before="200" w:after="120"/>
       </w:pPr>
@@ -3192,7 +3246,7 @@
         <w:drawing>
           <wp:inline xmlns:a="http://schemas.openxmlformats.org/drawingml/2006/main" xmlns:pic="http://schemas.openxmlformats.org/drawingml/2006/picture">
             <wp:extent cx="5688000" cy="3555000"/>
-            <wp:docPr id="1" name="Picture 1"/>
+            <wp:docPr id="2" name="Picture 2"/>
             <wp:cNvGraphicFramePr>
               <a:graphicFrameLocks noChangeAspect="1"/>
             </wp:cNvGraphicFramePr>
@@ -3204,7 +3258,7 @@
                     <pic:cNvPicPr/>
                   </pic:nvPicPr>
                   <pic:blipFill>
-                    <a:blip r:embed="rId9"/>
+                    <a:blip r:embed="rId10"/>
                     <a:stretch>
                       <a:fillRect/>
                     </a:stretch>
@@ -3234,7 +3288,7 @@
           <w:color w:val="595959"/>
           <w:sz w:val="18"/>
         </w:rPr>
-        <w:t>Hình 1. Trang import file Word của giảng viên (đã đăng nhập)</w:t>
+        <w:t>Hình 2. Trang import file Word của giảng viên (đã đăng nhập)</w:t>
       </w:r>
     </w:p>
     <w:p>
@@ -3246,7 +3300,7 @@
         <w:drawing>
           <wp:inline xmlns:a="http://schemas.openxmlformats.org/drawingml/2006/main" xmlns:pic="http://schemas.openxmlformats.org/drawingml/2006/picture">
             <wp:extent cx="4464000" cy="5580000"/>
-            <wp:docPr id="2" name="Picture 2"/>
+            <wp:docPr id="3" name="Picture 3"/>
             <wp:cNvGraphicFramePr>
               <a:graphicFrameLocks noChangeAspect="1"/>
             </wp:cNvGraphicFramePr>
@@ -3258,7 +3312,7 @@
                     <pic:cNvPicPr/>
                   </pic:nvPicPr>
                   <pic:blipFill>
-                    <a:blip r:embed="rId10"/>
+                    <a:blip r:embed="rId11"/>
                     <a:stretch>
                       <a:fillRect/>
                     </a:stretch>
@@ -3288,7 +3342,7 @@
           <w:color w:val="595959"/>
           <w:sz w:val="18"/>
         </w:rPr>
-        <w:t>Hình 2. Xem trước đề sau khi import: bài đọc gắn đúng nhóm câu, đáp án tô xanh, gợi ý tiếng Việt</w:t>
+        <w:t>Hình 3. Xem trước đề sau khi import: bài đọc gắn đúng nhóm câu, đáp án tô xanh, gợi ý tiếng Việt</w:t>
       </w:r>
     </w:p>
     <w:p>
@@ -3339,7 +3393,7 @@
         <w:drawing>
           <wp:inline xmlns:a="http://schemas.openxmlformats.org/drawingml/2006/main" xmlns:pic="http://schemas.openxmlformats.org/drawingml/2006/picture">
             <wp:extent cx="5400000" cy="3375000"/>
-            <wp:docPr id="3" name="Picture 3"/>
+            <wp:docPr id="4" name="Picture 4"/>
             <wp:cNvGraphicFramePr>
               <a:graphicFrameLocks noChangeAspect="1"/>
             </wp:cNvGraphicFramePr>
@@ -3351,7 +3405,7 @@
                     <pic:cNvPicPr/>
                   </pic:nvPicPr>
                   <pic:blipFill>
-                    <a:blip r:embed="rId11"/>
+                    <a:blip r:embed="rId12"/>
                     <a:stretch>
                       <a:fillRect/>
                     </a:stretch>
@@ -3381,7 +3435,7 @@
           <w:color w:val="595959"/>
           <w:sz w:val="18"/>
         </w:rPr>
-        <w:t>Hình 3. Trang đăng nhập của hệ thống (ABP Zero)</w:t>
+        <w:t>Hình 4. Trang đăng nhập của hệ thống (ABP Zero)</w:t>
       </w:r>
     </w:p>
     <w:p>
@@ -3419,7 +3473,7 @@
         <w:drawing>
           <wp:inline xmlns:a="http://schemas.openxmlformats.org/drawingml/2006/main" xmlns:pic="http://schemas.openxmlformats.org/drawingml/2006/picture">
             <wp:extent cx="5688000" cy="3555000"/>
-            <wp:docPr id="4" name="Picture 4"/>
+            <wp:docPr id="5" name="Picture 5"/>
             <wp:cNvGraphicFramePr>
               <a:graphicFrameLocks noChangeAspect="1"/>
             </wp:cNvGraphicFramePr>
@@ -3431,7 +3485,7 @@
                     <pic:cNvPicPr/>
                   </pic:nvPicPr>
                   <pic:blipFill>
-                    <a:blip r:embed="rId12"/>
+                    <a:blip r:embed="rId13"/>
                     <a:stretch>
                       <a:fillRect/>
                     </a:stretch>
@@ -3461,7 +3515,7 @@
           <w:color w:val="595959"/>
           <w:sz w:val="18"/>
         </w:rPr>
-        <w:t>Hình 4. Danh sách đề thi (đề đã xuất bản, 3 lượt làm)</w:t>
+        <w:t>Hình 5. Danh sách đề thi (đề đã xuất bản, 3 lượt làm)</w:t>
       </w:r>
     </w:p>
     <w:p>
@@ -3499,7 +3553,7 @@
         <w:drawing>
           <wp:inline xmlns:a="http://schemas.openxmlformats.org/drawingml/2006/main" xmlns:pic="http://schemas.openxmlformats.org/drawingml/2006/picture">
             <wp:extent cx="5400000" cy="3375000"/>
-            <wp:docPr id="5" name="Picture 5"/>
+            <wp:docPr id="6" name="Picture 6"/>
             <wp:cNvGraphicFramePr>
               <a:graphicFrameLocks noChangeAspect="1"/>
             </wp:cNvGraphicFramePr>
@@ -3511,7 +3565,7 @@
                     <pic:cNvPicPr/>
                   </pic:nvPicPr>
                   <pic:blipFill>
-                    <a:blip r:embed="rId13"/>
+                    <a:blip r:embed="rId14"/>
                     <a:stretch>
                       <a:fillRect/>
                     </a:stretch>
@@ -3541,7 +3595,7 @@
           <w:color w:val="595959"/>
           <w:sz w:val="18"/>
         </w:rPr>
-        <w:t>Hình 5. Form cập nhật câu hỏi: nội dung, 4 phương án, đáp án đúng và gợi ý</w:t>
+        <w:t>Hình 6. Form cập nhật câu hỏi: nội dung, 4 phương án, đáp án đúng và gợi ý</w:t>
       </w:r>
     </w:p>
     <w:p>
@@ -3605,7 +3659,7 @@
         <w:drawing>
           <wp:inline xmlns:a="http://schemas.openxmlformats.org/drawingml/2006/main" xmlns:pic="http://schemas.openxmlformats.org/drawingml/2006/picture">
             <wp:extent cx="5688000" cy="3555000"/>
-            <wp:docPr id="6" name="Picture 6"/>
+            <wp:docPr id="7" name="Picture 7"/>
             <wp:cNvGraphicFramePr>
               <a:graphicFrameLocks noChangeAspect="1"/>
             </wp:cNvGraphicFramePr>
@@ -3617,7 +3671,7 @@
                     <pic:cNvPicPr/>
                   </pic:nvPicPr>
                   <pic:blipFill>
-                    <a:blip r:embed="rId14"/>
+                    <a:blip r:embed="rId15"/>
                     <a:stretch>
                       <a:fillRect/>
                     </a:stretch>
@@ -3647,7 +3701,7 @@
           <w:color w:val="595959"/>
           <w:sz w:val="18"/>
         </w:rPr>
-        <w:t>Hình 6. Thống kê đề thi: 2 lượt làm, điểm TB 55, Top 10 câu sai</w:t>
+        <w:t>Hình 7. Thống kê đề thi: 2 lượt làm, điểm TB 55, Top 10 câu sai</w:t>
       </w:r>
     </w:p>
     <w:p>
@@ -3711,7 +3765,7 @@
         <w:drawing>
           <wp:inline xmlns:a="http://schemas.openxmlformats.org/drawingml/2006/main" xmlns:pic="http://schemas.openxmlformats.org/drawingml/2006/picture">
             <wp:extent cx="2592000" cy="5554286"/>
-            <wp:docPr id="7" name="Picture 7"/>
+            <wp:docPr id="8" name="Picture 8"/>
             <wp:cNvGraphicFramePr>
               <a:graphicFrameLocks noChangeAspect="1"/>
             </wp:cNvGraphicFramePr>
@@ -3723,7 +3777,7 @@
                     <pic:cNvPicPr/>
                   </pic:nvPicPr>
                   <pic:blipFill>
-                    <a:blip r:embed="rId15"/>
+                    <a:blip r:embed="rId16"/>
                     <a:stretch>
                       <a:fillRect/>
                     </a:stretch>
@@ -3753,7 +3807,7 @@
           <w:color w:val="595959"/>
           <w:sz w:val="18"/>
         </w:rPr>
-        <w:t>Hình 7. Danh sách đề trên app sinh viên</w:t>
+        <w:t>Hình 8. Danh sách đề trên app sinh viên</w:t>
       </w:r>
     </w:p>
     <w:p>
@@ -3826,7 +3880,7 @@
         <w:drawing>
           <wp:inline xmlns:a="http://schemas.openxmlformats.org/drawingml/2006/main" xmlns:pic="http://schemas.openxmlformats.org/drawingml/2006/picture">
             <wp:extent cx="2592000" cy="5554286"/>
-            <wp:docPr id="8" name="Picture 8"/>
+            <wp:docPr id="9" name="Picture 9"/>
             <wp:cNvGraphicFramePr>
               <a:graphicFrameLocks noChangeAspect="1"/>
             </wp:cNvGraphicFramePr>
@@ -3838,7 +3892,7 @@
                     <pic:cNvPicPr/>
                   </pic:nvPicPr>
                   <pic:blipFill>
-                    <a:blip r:embed="rId16"/>
+                    <a:blip r:embed="rId17"/>
                     <a:stretch>
                       <a:fillRect/>
                     </a:stretch>
@@ -3868,7 +3922,7 @@
           <w:color w:val="595959"/>
           <w:sz w:val="18"/>
         </w:rPr>
-        <w:t>Hình 8. Màn hình làm bài: đồng hồ 74:50, tiến độ 1/100, đáp án B đã chọn</w:t>
+        <w:t>Hình 9. Màn hình làm bài: đồng hồ 74:50, tiến độ 1/100, đáp án B đã chọn</w:t>
       </w:r>
     </w:p>
     <w:p>
@@ -3932,7 +3986,7 @@
         <w:drawing>
           <wp:inline xmlns:a="http://schemas.openxmlformats.org/drawingml/2006/main" xmlns:pic="http://schemas.openxmlformats.org/drawingml/2006/picture">
             <wp:extent cx="2951999" cy="14057138"/>
-            <wp:docPr id="9" name="Picture 9"/>
+            <wp:docPr id="10" name="Picture 10"/>
             <wp:cNvGraphicFramePr>
               <a:graphicFrameLocks noChangeAspect="1"/>
             </wp:cNvGraphicFramePr>
@@ -3944,7 +3998,7 @@
                     <pic:cNvPicPr/>
                   </pic:nvPicPr>
                   <pic:blipFill>
-                    <a:blip r:embed="rId17"/>
+                    <a:blip r:embed="rId18"/>
                     <a:stretch>
                       <a:fillRect/>
                     </a:stretch>
@@ -3974,7 +4028,7 @@
           <w:color w:val="595959"/>
           <w:sz w:val="18"/>
         </w:rPr>
-        <w:t>Hình 9. Kết quả 70/100 và phần xem lại đáp án kèm gợi ý</w:t>
+        <w:t>Hình 10. Kết quả 70/100 và phần xem lại đáp án kèm gợi ý</w:t>
       </w:r>
     </w:p>
     <w:p>
@@ -4181,7 +4235,7 @@
         <w:drawing>
           <wp:inline xmlns:a="http://schemas.openxmlformats.org/drawingml/2006/main" xmlns:pic="http://schemas.openxmlformats.org/drawingml/2006/picture">
             <wp:extent cx="5688000" cy="2938800"/>
-            <wp:docPr id="10" name="Picture 10"/>
+            <wp:docPr id="11" name="Picture 11"/>
             <wp:cNvGraphicFramePr>
               <a:graphicFrameLocks noChangeAspect="1"/>
             </wp:cNvGraphicFramePr>
@@ -4190,60 +4244,6 @@
                 <pic:pic>
                   <pic:nvPicPr>
                     <pic:cNvPr id="0" name="figma_t_final.png"/>
-                    <pic:cNvPicPr/>
-                  </pic:nvPicPr>
-                  <pic:blipFill>
-                    <a:blip r:embed="rId18"/>
-                    <a:stretch>
-                      <a:fillRect/>
-                    </a:stretch>
-                  </pic:blipFill>
-                  <pic:spPr>
-                    <a:xfrm>
-                      <a:off x="0" y="0"/>
-                      <a:ext cx="5688000" cy="2938800"/>
-                    </a:xfrm>
-                    <a:prstGeom prst="rect"/>
-                  </pic:spPr>
-                </pic:pic>
-              </a:graphicData>
-            </a:graphic>
-          </wp:inline>
-        </w:drawing>
-      </w:r>
-    </w:p>
-    <w:p>
-      <w:pPr>
-        <w:spacing w:after="240"/>
-        <w:jc w:val="center"/>
-      </w:pPr>
-      <w:r>
-        <w:rPr>
-          <w:i/>
-          <w:color w:val="595959"/>
-          <w:sz w:val="18"/>
-        </w:rPr>
-        <w:t>Hình 10. Page Teacher Web trong Figma (6 frame)</w:t>
-      </w:r>
-    </w:p>
-    <w:p>
-      <w:pPr>
-        <w:spacing w:after="60"/>
-        <w:jc w:val="center"/>
-      </w:pPr>
-      <w:r>
-        <w:drawing>
-          <wp:inline xmlns:a="http://schemas.openxmlformats.org/drawingml/2006/main" xmlns:pic="http://schemas.openxmlformats.org/drawingml/2006/picture">
-            <wp:extent cx="5688000" cy="2938800"/>
-            <wp:docPr id="11" name="Picture 11"/>
-            <wp:cNvGraphicFramePr>
-              <a:graphicFrameLocks noChangeAspect="1"/>
-            </wp:cNvGraphicFramePr>
-            <a:graphic>
-              <a:graphicData uri="http://schemas.openxmlformats.org/drawingml/2006/picture">
-                <pic:pic>
-                  <pic:nvPicPr>
-                    <pic:cNvPr id="0" name="figma_mobile_fit2.png"/>
                     <pic:cNvPicPr/>
                   </pic:nvPicPr>
                   <pic:blipFill>
@@ -4277,7 +4277,61 @@
           <w:color w:val="595959"/>
           <w:sz w:val="18"/>
         </w:rPr>
-        <w:t>Hình 11. Page Student Mobile trong Figma (6 frame)</w:t>
+        <w:t>Hình 11. Page Teacher Web trong Figma (6 frame)</w:t>
+      </w:r>
+    </w:p>
+    <w:p>
+      <w:pPr>
+        <w:spacing w:after="60"/>
+        <w:jc w:val="center"/>
+      </w:pPr>
+      <w:r>
+        <w:drawing>
+          <wp:inline xmlns:a="http://schemas.openxmlformats.org/drawingml/2006/main" xmlns:pic="http://schemas.openxmlformats.org/drawingml/2006/picture">
+            <wp:extent cx="5688000" cy="2938800"/>
+            <wp:docPr id="12" name="Picture 12"/>
+            <wp:cNvGraphicFramePr>
+              <a:graphicFrameLocks noChangeAspect="1"/>
+            </wp:cNvGraphicFramePr>
+            <a:graphic>
+              <a:graphicData uri="http://schemas.openxmlformats.org/drawingml/2006/picture">
+                <pic:pic>
+                  <pic:nvPicPr>
+                    <pic:cNvPr id="0" name="figma_mobile_fit2.png"/>
+                    <pic:cNvPicPr/>
+                  </pic:nvPicPr>
+                  <pic:blipFill>
+                    <a:blip r:embed="rId20"/>
+                    <a:stretch>
+                      <a:fillRect/>
+                    </a:stretch>
+                  </pic:blipFill>
+                  <pic:spPr>
+                    <a:xfrm>
+                      <a:off x="0" y="0"/>
+                      <a:ext cx="5688000" cy="2938800"/>
+                    </a:xfrm>
+                    <a:prstGeom prst="rect"/>
+                  </pic:spPr>
+                </pic:pic>
+              </a:graphicData>
+            </a:graphic>
+          </wp:inline>
+        </w:drawing>
+      </w:r>
+    </w:p>
+    <w:p>
+      <w:pPr>
+        <w:spacing w:after="240"/>
+        <w:jc w:val="center"/>
+      </w:pPr>
+      <w:r>
+        <w:rPr>
+          <w:i/>
+          <w:color w:val="595959"/>
+          <w:sz w:val="18"/>
+        </w:rPr>
+        <w:t>Hình 12. Page Student Mobile trong Figma (6 frame)</w:t>
       </w:r>
     </w:p>
     <w:p>

</xml_diff>

<commit_message>
Sơ đồ CSDL đọc trực tiếp từ SQL Server (7 bảng, 109 cột, 34 FK) + DBML cho dbdiagram; báo cáo dùng Hình 1 mới
</commit_message>
<xml_diff>
--- a/Files/BaoCao_TOEIC_Reading.docx
+++ b/Files/BaoCao_TOEIC_Reading.docx
@@ -1863,7 +1863,7 @@
       <w:r>
         <w:drawing>
           <wp:inline xmlns:a="http://schemas.openxmlformats.org/drawingml/2006/main" xmlns:pic="http://schemas.openxmlformats.org/drawingml/2006/picture">
-            <wp:extent cx="5832000" cy="4793425"/>
+            <wp:extent cx="5903999" cy="4912127"/>
             <wp:docPr id="1" name="Picture 1"/>
             <wp:cNvGraphicFramePr>
               <a:graphicFrameLocks noChangeAspect="1"/>
@@ -1884,7 +1884,7 @@
                   <pic:spPr>
                     <a:xfrm>
                       <a:off x="0" y="0"/>
-                      <a:ext cx="5832000" cy="4793425"/>
+                      <a:ext cx="5903999" cy="4912127"/>
                     </a:xfrm>
                     <a:prstGeom prst="rect"/>
                   </pic:spPr>
@@ -1906,7 +1906,7 @@
           <w:color w:val="595959"/>
           <w:sz w:val="18"/>
         </w:rPr>
-        <w:t>Hình 1. Sơ đồ quan hệ 7 bảng nghiệp vụ trong ToeicDb (khoá chính, khoá ngoại, quan hệ 1–n)</w:t>
+        <w:t>Hình 1. Sơ đồ CSDL đọc trực tiếp từ SQL Server: 7 bảng nghiệp vụ, khoá chính/khoá ngoại, kiểu dữ liệu thật và số dòng sau khi chạy thử</w:t>
       </w:r>
     </w:p>
     <w:p>

</xml_diff>

<commit_message>
Báo cáo 19 trang: thêm mục 7.5 làm bài nhiều lần + Hình 11 (lịch sử lượt làm), API GetStudentAttempts
</commit_message>
<xml_diff>
--- a/Files/BaoCao_TOEIC_Reading.docx
+++ b/Files/BaoCao_TOEIC_Reading.docx
@@ -4033,6 +4033,86 @@
     </w:p>
     <w:p>
       <w:pPr>
+        <w:pStyle w:val="Heading2"/>
+        <w:spacing w:before="200" w:after="120"/>
+      </w:pPr>
+      <w:r>
+        <w:rPr>
+          <w:rFonts w:ascii="Calibri" w:hAnsi="Calibri"/>
+          <w:color w:val="1D6FE0"/>
+        </w:rPr>
+        <w:t>7.5. Làm bài nhiều lần và lịch sử làm bài</w:t>
+      </w:r>
+    </w:p>
+    <w:p>
+      <w:pPr>
+        <w:spacing w:after="120" w:before="80"/>
+      </w:pPr>
+      <w:r>
+        <w:rPr>
+          <w:b w:val="0"/>
+          <w:i w:val="0"/>
+          <w:sz w:val="22"/>
+        </w:rPr>
+        <w:t>Mỗi MSSV được làm một đề nhiều lần, không giới hạn. Mỗi lượt là một bản ghi riêng trong RtAttempts nên điểm các lượt độc lập và giảng viên vẫn thống kê được toàn bộ. Thẻ đề hiển thị số lần đã làm và điểm cao nhất; khi bỏ dở, nút chuyển thành “Tiếp tục bài đang làm” để không mất đáp án đã chọn. Màn hình kết quả có thêm hai lựa chọn: “Làm lại bài” (tạo lượt mới ngay) và “Chọn đề khác” (về danh sách đề). Hệ thống có 2 đề đã xuất bản để minh hoạ việc làm thêm đề khác.</w:t>
+      </w:r>
+    </w:p>
+    <w:p>
+      <w:pPr>
+        <w:spacing w:after="60"/>
+        <w:jc w:val="center"/>
+      </w:pPr>
+      <w:r>
+        <w:drawing>
+          <wp:inline xmlns:a="http://schemas.openxmlformats.org/drawingml/2006/main" xmlns:pic="http://schemas.openxmlformats.org/drawingml/2006/picture">
+            <wp:extent cx="3096000" cy="6700062"/>
+            <wp:docPr id="11" name="Picture 11"/>
+            <wp:cNvGraphicFramePr>
+              <a:graphicFrameLocks noChangeAspect="1"/>
+            </wp:cNvGraphicFramePr>
+            <a:graphic>
+              <a:graphicData uri="http://schemas.openxmlformats.org/drawingml/2006/picture">
+                <pic:pic>
+                  <pic:nvPicPr>
+                    <pic:cNvPr id="0" name="mobile_history.png"/>
+                    <pic:cNvPicPr/>
+                  </pic:nvPicPr>
+                  <pic:blipFill>
+                    <a:blip r:embed="rId19"/>
+                    <a:stretch>
+                      <a:fillRect/>
+                    </a:stretch>
+                  </pic:blipFill>
+                  <pic:spPr>
+                    <a:xfrm>
+                      <a:off x="0" y="0"/>
+                      <a:ext cx="3096000" cy="6700062"/>
+                    </a:xfrm>
+                    <a:prstGeom prst="rect"/>
+                  </pic:spPr>
+                </pic:pic>
+              </a:graphicData>
+            </a:graphic>
+          </wp:inline>
+        </w:drawing>
+      </w:r>
+    </w:p>
+    <w:p>
+      <w:pPr>
+        <w:spacing w:after="240"/>
+        <w:jc w:val="center"/>
+      </w:pPr>
+      <w:r>
+        <w:rPr>
+          <w:i/>
+          <w:color w:val="595959"/>
+          <w:sz w:val="18"/>
+        </w:rPr>
+        <w:t>Hình 11. Lịch sử các lượt làm bài của một MSSV (điểm, thời điểm, đúng–sai–bỏ)</w:t>
+      </w:r>
+    </w:p>
+    <w:p>
+      <w:pPr>
         <w:pStyle w:val="Heading1"/>
         <w:spacing w:before="280" w:after="120"/>
       </w:pPr>
@@ -4235,7 +4315,7 @@
         <w:drawing>
           <wp:inline xmlns:a="http://schemas.openxmlformats.org/drawingml/2006/main" xmlns:pic="http://schemas.openxmlformats.org/drawingml/2006/picture">
             <wp:extent cx="5688000" cy="2938800"/>
-            <wp:docPr id="11" name="Picture 11"/>
+            <wp:docPr id="12" name="Picture 12"/>
             <wp:cNvGraphicFramePr>
               <a:graphicFrameLocks noChangeAspect="1"/>
             </wp:cNvGraphicFramePr>
@@ -4244,60 +4324,6 @@
                 <pic:pic>
                   <pic:nvPicPr>
                     <pic:cNvPr id="0" name="figma_t_final.png"/>
-                    <pic:cNvPicPr/>
-                  </pic:nvPicPr>
-                  <pic:blipFill>
-                    <a:blip r:embed="rId19"/>
-                    <a:stretch>
-                      <a:fillRect/>
-                    </a:stretch>
-                  </pic:blipFill>
-                  <pic:spPr>
-                    <a:xfrm>
-                      <a:off x="0" y="0"/>
-                      <a:ext cx="5688000" cy="2938800"/>
-                    </a:xfrm>
-                    <a:prstGeom prst="rect"/>
-                  </pic:spPr>
-                </pic:pic>
-              </a:graphicData>
-            </a:graphic>
-          </wp:inline>
-        </w:drawing>
-      </w:r>
-    </w:p>
-    <w:p>
-      <w:pPr>
-        <w:spacing w:after="240"/>
-        <w:jc w:val="center"/>
-      </w:pPr>
-      <w:r>
-        <w:rPr>
-          <w:i/>
-          <w:color w:val="595959"/>
-          <w:sz w:val="18"/>
-        </w:rPr>
-        <w:t>Hình 11. Page Teacher Web trong Figma (6 frame)</w:t>
-      </w:r>
-    </w:p>
-    <w:p>
-      <w:pPr>
-        <w:spacing w:after="60"/>
-        <w:jc w:val="center"/>
-      </w:pPr>
-      <w:r>
-        <w:drawing>
-          <wp:inline xmlns:a="http://schemas.openxmlformats.org/drawingml/2006/main" xmlns:pic="http://schemas.openxmlformats.org/drawingml/2006/picture">
-            <wp:extent cx="5688000" cy="2938800"/>
-            <wp:docPr id="12" name="Picture 12"/>
-            <wp:cNvGraphicFramePr>
-              <a:graphicFrameLocks noChangeAspect="1"/>
-            </wp:cNvGraphicFramePr>
-            <a:graphic>
-              <a:graphicData uri="http://schemas.openxmlformats.org/drawingml/2006/picture">
-                <pic:pic>
-                  <pic:nvPicPr>
-                    <pic:cNvPr id="0" name="figma_mobile_fit2.png"/>
                     <pic:cNvPicPr/>
                   </pic:nvPicPr>
                   <pic:blipFill>
@@ -4331,7 +4357,61 @@
           <w:color w:val="595959"/>
           <w:sz w:val="18"/>
         </w:rPr>
-        <w:t>Hình 12. Page Student Mobile trong Figma (6 frame)</w:t>
+        <w:t>Hình 12. Page Teacher Web trong Figma (6 frame)</w:t>
+      </w:r>
+    </w:p>
+    <w:p>
+      <w:pPr>
+        <w:spacing w:after="60"/>
+        <w:jc w:val="center"/>
+      </w:pPr>
+      <w:r>
+        <w:drawing>
+          <wp:inline xmlns:a="http://schemas.openxmlformats.org/drawingml/2006/main" xmlns:pic="http://schemas.openxmlformats.org/drawingml/2006/picture">
+            <wp:extent cx="5688000" cy="2938800"/>
+            <wp:docPr id="13" name="Picture 13"/>
+            <wp:cNvGraphicFramePr>
+              <a:graphicFrameLocks noChangeAspect="1"/>
+            </wp:cNvGraphicFramePr>
+            <a:graphic>
+              <a:graphicData uri="http://schemas.openxmlformats.org/drawingml/2006/picture">
+                <pic:pic>
+                  <pic:nvPicPr>
+                    <pic:cNvPr id="0" name="figma_mobile_fit2.png"/>
+                    <pic:cNvPicPr/>
+                  </pic:nvPicPr>
+                  <pic:blipFill>
+                    <a:blip r:embed="rId21"/>
+                    <a:stretch>
+                      <a:fillRect/>
+                    </a:stretch>
+                  </pic:blipFill>
+                  <pic:spPr>
+                    <a:xfrm>
+                      <a:off x="0" y="0"/>
+                      <a:ext cx="5688000" cy="2938800"/>
+                    </a:xfrm>
+                    <a:prstGeom prst="rect"/>
+                  </pic:spPr>
+                </pic:pic>
+              </a:graphicData>
+            </a:graphic>
+          </wp:inline>
+        </w:drawing>
+      </w:r>
+    </w:p>
+    <w:p>
+      <w:pPr>
+        <w:spacing w:after="240"/>
+        <w:jc w:val="center"/>
+      </w:pPr>
+      <w:r>
+        <w:rPr>
+          <w:i/>
+          <w:color w:val="595959"/>
+          <w:sz w:val="18"/>
+        </w:rPr>
+        <w:t>Hình 13. Page Student Mobile trong Figma (6 frame)</w:t>
       </w:r>
     </w:p>
     <w:p>

</xml_diff>